<commit_message>
feat(ui): redisenar landing con paleta institucional, 5 presets y justificacion tecnica
</commit_message>
<xml_diff>
--- a/entregables/Desarrollo_de_IA_ev_N3_actualizado.docx
+++ b/entregables/Desarrollo_de_IA_ev_N3_actualizado.docx
@@ -195,7 +195,7 @@
               <w:t xml:space="preserve">• Repositorio en GitHub: </w:t>
             </w:r>
             <w:r>
-              <w:t>https://github.com/Malvadapapa/desarrollo-ia-evidencia-2</w:t>
+              <w:t>https://github.com/TeamYear3/Desarrollo-de-IA</w:t>
               <w:br/>
             </w:r>
             <w:r>
@@ -205,7 +205,7 @@
               <w:t xml:space="preserve">• Notebook Ejecutado (Evidencia 3): </w:t>
             </w:r>
             <w:r>
-              <w:t>https://github.com/Malvadapapa/desarrollo-ia-evidencia-2/blob/main/notebooks/Evidencia_3_Optimizacion.ipynb</w:t>
+              <w:t>https://github.com/TeamYear3/Desarrollo-de-IA/blob/main/notebooks/Evidencia_3_Optimizacion.ipynb</w:t>
               <w:br/>
             </w:r>
             <w:r>
@@ -215,7 +215,7 @@
               <w:t xml:space="preserve">• Modelo Serializado (Producción): </w:t>
             </w:r>
             <w:r>
-              <w:t>https://github.com/Malvadapapa/desarrollo-ia-evidencia-2/blob/main/models/best_model.joblib</w:t>
+              <w:t>https://github.com/TeamYear3/Desarrollo-de-IA/blob/main/models/best_model.joblib</w:t>
               <w:br/>
             </w:r>
             <w:r>
@@ -225,7 +225,7 @@
               <w:t xml:space="preserve">• Script de Inferencia CLI: </w:t>
             </w:r>
             <w:r>
-              <w:t>https://github.com/Malvadapapa/desarrollo-ia-evidencia-2/blob/main/src/predict.py</w:t>
+              <w:t>https://github.com/TeamYear3/Desarrollo-de-IA/blob/main/src/predict.py</w:t>
               <w:br/>
             </w:r>
             <w:r>
@@ -235,7 +235,7 @@
               <w:t xml:space="preserve">• Mini Backend y Landing Interactiva: </w:t>
             </w:r>
             <w:r>
-              <w:t>https://github.com/Malvadapapa/desarrollo-ia-evidencia-2/tree/main/demo_app</w:t>
+              <w:t>https://github.com/TeamYear3/Desarrollo-de-IA/tree/main/demo_app</w:t>
             </w:r>
           </w:p>
         </w:tc>

</xml_diff>

<commit_message>
docs: incorporar enlace de despliegue en produccion Vercel en documentacion y landing
</commit_message>
<xml_diff>
--- a/entregables/Desarrollo_de_IA_ev_N3_actualizado.docx
+++ b/entregables/Desarrollo_de_IA_ev_N3_actualizado.docx
@@ -192,6 +192,16 @@
               <w:rPr>
                 <w:b/>
               </w:rPr>
+              <w:t xml:space="preserve">• Aplicación Web en Producción (Vercel Live): </w:t>
+            </w:r>
+            <w:r>
+              <w:t>https://desarrollo-de-ia.vercel.app/</w:t>
+              <w:br/>
+            </w:r>
+            <w:r>
+              <w:rPr>
+                <w:b/>
+              </w:rPr>
               <w:t xml:space="preserve">• Repositorio en GitHub: </w:t>
             </w:r>
             <w:r>
@@ -232,10 +242,10 @@
               <w:rPr>
                 <w:b/>
               </w:rPr>
-              <w:t xml:space="preserve">• Mini Backend y Landing Interactiva: </w:t>
+              <w:t xml:space="preserve">• Código Fuente del Despliegue: </w:t>
             </w:r>
             <w:r>
-              <w:t>https://github.com/TeamYear3/Desarrollo-de-IA/tree/main/demo_app</w:t>
+              <w:t>https://github.com/Malvadapapa/Desarrollo-de-IA</w:t>
             </w:r>
           </w:p>
         </w:tc>

</xml_diff>